<commit_message>
docs(MAPA-ORG-001): GQA = Flavio Fernandes (restaura independencia); Carol so QA
Reconcilia .md/.docx ao .xlsx (que ja trazia Flavio como GQA) e ao
CV-Flavio-Fernandes_GQA-Arquitetura. Antes, .md/.docx punham Caroline (Carol)
como titular de QA E de GQA simultaneamente, ferindo a independencia exigida
(a QA/V&V nao pode auditar o proprio trabalho).

- §5: GQA / Qualidade do Processo -> Flavio Fernandes (Carol permanece QA).
- Cabecalho 1.3/15-06 -> 1.4/18-06 + linha de revisao v1.4.
- Nos projetos AASP_CNJ e AASP_AndamentosProcessuais o auditor de GQA
  independente continua sendo Jonathan Barbosa (nivel de projeto).

Nao alterado (pendente de decisao): sobrenome da QA (Jenifer x Sousa) e a
reserva de QA (Jonatan Silva, Leticia Moraes).

Co-Authored-By: Claude Opus 4.8 (1M context) <noreply@anthropic.com>
</commit_message>
<xml_diff>
--- a/mps-nivel-c/oficial/05_capacidade/MAPA-ORG-001_Matriz-de-Papeis-e-Responsabilidades.docx
+++ b/mps-nivel-c/oficial/05_capacidade/MAPA-ORG-001_Matriz-de-Papeis-e-Responsabilidades.docx
@@ -226,7 +226,7 @@
                 <w:i w:val="0"/>
                 <w:sz w:val="20"/>
               </w:rPr>
-              <w:t>1.3</w:t>
+              <w:t>1.4</w:t>
             </w:r>
           </w:p>
         </w:tc>
@@ -282,7 +282,7 @@
                 <w:i w:val="0"/>
                 <w:sz w:val="20"/>
               </w:rPr>
-              <w:t>15/06/2026</w:t>
+              <w:t>18/06/2026</w:t>
             </w:r>
           </w:p>
         </w:tc>
@@ -4785,7 +4785,7 @@
                 <w:i w:val="0"/>
                 <w:sz w:val="20"/>
               </w:rPr>
-              <w:t>Caroline Jenifer (Carol)</w:t>
+              <w:t>Flávio Fernandes</w:t>
             </w:r>
           </w:p>
         </w:tc>
@@ -4835,7 +4835,7 @@
                 <w:i w:val="0"/>
                 <w:sz w:val="20"/>
               </w:rPr>
-              <w:t>CV Carol (FIAP, 7+ anos QA); REG-CAP-012 (automação de testes); REG-CAP-007/008/009</w:t>
+              <w:t>CV Flávio (Azure Architect Expert, TOGAF, COBIT, MBA FGV); REG-CAP-007/009</w:t>
             </w:r>
           </w:p>
         </w:tc>
@@ -6060,6 +6060,112 @@
                 <w:i w:val="0"/>
                 <w:sz w:val="20"/>
               </w:rPr>
+              <w:t>1.4</w:t>
+            </w:r>
+          </w:p>
+        </w:tc>
+        <w:tc>
+          <w:tcPr>
+            <w:tcW w:type="dxa" w:w="2225"/>
+            <w:tcMar>
+              <w:top w:w="60" w:type="dxa"/>
+              <w:bottom w:w="60" w:type="dxa"/>
+              <w:left w:w="100" w:type="dxa"/>
+              <w:right w:w="100" w:type="dxa"/>
+            </w:tcMar>
+          </w:tcPr>
+          <w:p>
+            <w:pPr>
+              <w:spacing w:before="40" w:after="40"/>
+            </w:pPr>
+            <w:r>
+              <w:rPr>
+                <w:rFonts w:ascii="Calibri" w:hAnsi="Calibri"/>
+                <w:b w:val="0"/>
+                <w:i w:val="0"/>
+                <w:sz w:val="20"/>
+              </w:rPr>
+              <w:t>18/06/2026</w:t>
+            </w:r>
+          </w:p>
+        </w:tc>
+        <w:tc>
+          <w:tcPr>
+            <w:tcW w:type="dxa" w:w="2225"/>
+            <w:tcMar>
+              <w:top w:w="60" w:type="dxa"/>
+              <w:bottom w:w="60" w:type="dxa"/>
+              <w:left w:w="100" w:type="dxa"/>
+              <w:right w:w="100" w:type="dxa"/>
+            </w:tcMar>
+          </w:tcPr>
+          <w:p>
+            <w:pPr>
+              <w:spacing w:before="40" w:after="40"/>
+            </w:pPr>
+            <w:r>
+              <w:rPr>
+                <w:rFonts w:ascii="Calibri" w:hAnsi="Calibri"/>
+                <w:b w:val="0"/>
+                <w:i w:val="0"/>
+                <w:sz w:val="20"/>
+              </w:rPr>
+              <w:t>Time de Melhoria Contínua</w:t>
+            </w:r>
+          </w:p>
+        </w:tc>
+        <w:tc>
+          <w:tcPr>
+            <w:tcW w:type="dxa" w:w="2225"/>
+            <w:tcMar>
+              <w:top w:w="60" w:type="dxa"/>
+              <w:bottom w:w="60" w:type="dxa"/>
+              <w:left w:w="100" w:type="dxa"/>
+              <w:right w:w="100" w:type="dxa"/>
+            </w:tcMar>
+          </w:tcPr>
+          <w:p>
+            <w:pPr>
+              <w:spacing w:before="40" w:after="40"/>
+            </w:pPr>
+            <w:r>
+              <w:rPr>
+                <w:rFonts w:ascii="Calibri" w:hAnsi="Calibri"/>
+                <w:b w:val="0"/>
+                <w:i w:val="0"/>
+                <w:sz w:val="20"/>
+              </w:rPr>
+              <w:t>Titularidade da GQA / Qualidade do Processo corrigida de Caroline Jenifer (Carol) para Flávio Fernandes, restaurando a independência da GQA (a QA/V&amp;V não pode auditar o próprio trabalho); §5 alinhada ao .xlsx e ao CV-Flavio-Fernandes_GQA-Arquitetura. Nos projetos AASP_CNJ e AASP_AndamentosProcessuais o auditor de GQA independente é Jonathan Barbosa. Carol permanece titular de QA.</w:t>
+            </w:r>
+          </w:p>
+        </w:tc>
+      </w:tr>
+      <w:tr>
+        <w:trPr>
+          <w:cantSplit w:val="1"/>
+        </w:trPr>
+        <w:tc>
+          <w:tcPr>
+            <w:tcW w:type="dxa" w:w="2225"/>
+            <w:tcMar>
+              <w:top w:w="60" w:type="dxa"/>
+              <w:bottom w:w="60" w:type="dxa"/>
+              <w:left w:w="100" w:type="dxa"/>
+              <w:right w:w="100" w:type="dxa"/>
+            </w:tcMar>
+            <w:shd w:val="clear" w:color="auto" w:fill="F0F4F8"/>
+          </w:tcPr>
+          <w:p>
+            <w:pPr>
+              <w:spacing w:before="40" w:after="40"/>
+            </w:pPr>
+            <w:r>
+              <w:rPr>
+                <w:rFonts w:ascii="Calibri" w:hAnsi="Calibri"/>
+                <w:b/>
+                <w:i w:val="0"/>
+                <w:sz w:val="20"/>
+              </w:rPr>
               <w:t>1.3</w:t>
             </w:r>
           </w:p>

</xml_diff>

<commit_message>
docs(MAPA-ORG-001): D3 — Jonathan Barbosa como auditor de GQA de projeto (v1.5)
Resolve a NC da auditoria "auditor de GQA do projeto nao consta na matriz org".
- §5 (GQA / Qualidade do Processo): Equipe passa a incluir Jonathan Barbosa
  (auditor de GQA de projeto — AASP_AndamentosProcessuais e AASP_CNJ); Flavio
  Fernandes mantido como titular organizacional (modelo de 2 niveis).
- Evidencia: auditorias de projeto em GQA-AASPAP01-001 e GQA-AASPCNJ01-001.
- .md, .docx e .xlsx atualizados; versao 1.4 -> 1.5 + linha de revisao.

Co-Authored-By: Claude Opus 4.8 (1M context) <noreply@anthropic.com>
</commit_message>
<xml_diff>
--- a/mps-nivel-c/oficial/05_capacidade/MAPA-ORG-001_Matriz-de-Papeis-e-Responsabilidades.docx
+++ b/mps-nivel-c/oficial/05_capacidade/MAPA-ORG-001_Matriz-de-Papeis-e-Responsabilidades.docx
@@ -226,7 +226,7 @@
                 <w:i w:val="0"/>
                 <w:sz w:val="20"/>
               </w:rPr>
-              <w:t>1.4</w:t>
+              <w:t>1.5</w:t>
             </w:r>
           </w:p>
         </w:tc>
@@ -4810,7 +4810,7 @@
                 <w:i w:val="0"/>
                 <w:sz w:val="20"/>
               </w:rPr>
-              <w:t>—</w:t>
+              <w:t>Jonathan Barbosa (auditor de GQA de projeto — AASP_AndamentosProcessuais e AASP_CNJ)</w:t>
             </w:r>
           </w:p>
         </w:tc>
@@ -4835,7 +4835,7 @@
                 <w:i w:val="0"/>
                 <w:sz w:val="20"/>
               </w:rPr>
-              <w:t>CV Flávio (Azure Architect Expert, TOGAF, COBIT, MBA FGV); REG-CAP-007/009</w:t>
+              <w:t>CV Flávio (Azure Architect Expert, TOGAF, COBIT, MBA FGV); REG-CAP-007/009; auditorias de projeto em GQA-AASPAP01-001 e GQA-AASPCNJ01-001 (Jonathan Barbosa)</w:t>
             </w:r>
           </w:p>
         </w:tc>
@@ -6060,6 +6060,112 @@
                 <w:i w:val="0"/>
                 <w:sz w:val="20"/>
               </w:rPr>
+              <w:t>1.5</w:t>
+            </w:r>
+          </w:p>
+        </w:tc>
+        <w:tc>
+          <w:tcPr>
+            <w:tcW w:type="dxa" w:w="2225"/>
+            <w:tcMar>
+              <w:top w:w="60" w:type="dxa"/>
+              <w:bottom w:w="60" w:type="dxa"/>
+              <w:left w:w="100" w:type="dxa"/>
+              <w:right w:w="100" w:type="dxa"/>
+            </w:tcMar>
+          </w:tcPr>
+          <w:p>
+            <w:pPr>
+              <w:spacing w:before="40" w:after="40"/>
+            </w:pPr>
+            <w:r>
+              <w:rPr>
+                <w:rFonts w:ascii="Calibri" w:hAnsi="Calibri"/>
+                <w:b w:val="0"/>
+                <w:i w:val="0"/>
+                <w:sz w:val="20"/>
+              </w:rPr>
+              <w:t>18/06/2026</w:t>
+            </w:r>
+          </w:p>
+        </w:tc>
+        <w:tc>
+          <w:tcPr>
+            <w:tcW w:type="dxa" w:w="2225"/>
+            <w:tcMar>
+              <w:top w:w="60" w:type="dxa"/>
+              <w:bottom w:w="60" w:type="dxa"/>
+              <w:left w:w="100" w:type="dxa"/>
+              <w:right w:w="100" w:type="dxa"/>
+            </w:tcMar>
+          </w:tcPr>
+          <w:p>
+            <w:pPr>
+              <w:spacing w:before="40" w:after="40"/>
+            </w:pPr>
+            <w:r>
+              <w:rPr>
+                <w:rFonts w:ascii="Calibri" w:hAnsi="Calibri"/>
+                <w:b w:val="0"/>
+                <w:i w:val="0"/>
+                <w:sz w:val="20"/>
+              </w:rPr>
+              <w:t>Time de Melhoria Contínua</w:t>
+            </w:r>
+          </w:p>
+        </w:tc>
+        <w:tc>
+          <w:tcPr>
+            <w:tcW w:type="dxa" w:w="2225"/>
+            <w:tcMar>
+              <w:top w:w="60" w:type="dxa"/>
+              <w:bottom w:w="60" w:type="dxa"/>
+              <w:left w:w="100" w:type="dxa"/>
+              <w:right w:w="100" w:type="dxa"/>
+            </w:tcMar>
+          </w:tcPr>
+          <w:p>
+            <w:pPr>
+              <w:spacing w:before="40" w:after="40"/>
+            </w:pPr>
+            <w:r>
+              <w:rPr>
+                <w:rFonts w:ascii="Calibri" w:hAnsi="Calibri"/>
+                <w:b w:val="0"/>
+                <w:i w:val="0"/>
+                <w:sz w:val="20"/>
+              </w:rPr>
+              <w:t>Incluído Jonathan Barbosa na §5 como auditor de GQA de projeto (coluna Equipe da GQA), mantendo Flávio Fernandes como titular organizacional — modelo de 2 níveis: dono da função GQA na organização + auditor independente por projeto (GQA-AASPAP01-001 e GQA-AASPCNJ01-001).</w:t>
+            </w:r>
+          </w:p>
+        </w:tc>
+      </w:tr>
+      <w:tr>
+        <w:trPr>
+          <w:cantSplit w:val="1"/>
+        </w:trPr>
+        <w:tc>
+          <w:tcPr>
+            <w:tcW w:type="dxa" w:w="2225"/>
+            <w:tcMar>
+              <w:top w:w="60" w:type="dxa"/>
+              <w:bottom w:w="60" w:type="dxa"/>
+              <w:left w:w="100" w:type="dxa"/>
+              <w:right w:w="100" w:type="dxa"/>
+            </w:tcMar>
+            <w:shd w:val="clear" w:color="auto" w:fill="F0F4F8"/>
+          </w:tcPr>
+          <w:p>
+            <w:pPr>
+              <w:spacing w:before="40" w:after="40"/>
+            </w:pPr>
+            <w:r>
+              <w:rPr>
+                <w:rFonts w:ascii="Calibri" w:hAnsi="Calibri"/>
+                <w:b/>
+                <w:i w:val="0"/>
+                <w:sz w:val="20"/>
+              </w:rPr>
               <w:t>1.4</w:t>
             </w:r>
           </w:p>

</xml_diff>